<commit_message>
Added Completed Test plan
</commit_message>
<xml_diff>
--- a/Green_Team_Moffat_Bay_Tests_Complete.docx
+++ b/Green_Team_Moffat_Bay_Tests_Complete.docx
@@ -1,6 +1,6 @@
 
 <file path=word/document.xml><?xml version="1.0" encoding="utf-8"?>
-<w:document xmlns:wpc="http://schemas.microsoft.com/office/word/2010/wordprocessingCanvas" xmlns:cx="http://schemas.microsoft.com/office/drawing/2014/chartex" xmlns:cx1="http://schemas.microsoft.com/office/drawing/2015/9/8/chartex" xmlns:cx2="http://schemas.microsoft.com/office/drawing/2015/10/21/chartex" xmlns:cx3="http://schemas.microsoft.com/office/drawing/2016/5/9/chartex" xmlns:cx4="http://schemas.microsoft.com/office/drawing/2016/5/10/chartex" xmlns:cx5="http://schemas.microsoft.com/office/drawing/2016/5/11/chartex" xmlns:cx6="http://schemas.microsoft.com/office/drawing/2016/5/12/chartex" xmlns:cx7="http://schemas.microsoft.com/office/drawing/2016/5/13/chartex" xmlns:cx8="http://schemas.microsoft.com/office/drawing/2016/5/14/chartex" xmlns:mc="http://schemas.openxmlformats.org/markup-compatibility/2006" xmlns:aink="http://schemas.microsoft.com/office/drawing/2016/ink" xmlns:am3d="http://schemas.microsoft.com/office/drawing/2017/model3d" xmlns:o="urn:schemas-microsoft-com:office:office" xmlns:oel="http://schemas.microsoft.com/office/2019/extlst" xmlns:r="http://schemas.openxmlformats.org/officeDocument/2006/relationships" xmlns:m="http://schemas.openxmlformats.org/officeDocument/2006/math" xmlns:v="urn:schemas-microsoft-com:vml" xmlns:wp14="http://schemas.microsoft.com/office/word/2010/wordprocessingDrawing" xmlns:wp="http://schemas.openxmlformats.org/drawingml/2006/wordprocessingDrawing" xmlns:w10="urn:schemas-microsoft-com:office:word" xmlns:w="http://schemas.openxmlformats.org/wordprocessingml/2006/main" xmlns:w14="http://schemas.microsoft.com/office/word/2010/wordml" xmlns:w15="http://schemas.microsoft.com/office/word/2012/wordml" xmlns:w16cex="http://schemas.microsoft.com/office/word/2018/wordml/cex" xmlns:w16cid="http://schemas.microsoft.com/office/word/2016/wordml/cid" xmlns:w16="http://schemas.microsoft.com/office/word/2018/wordml" xmlns:w16du="http://schemas.microsoft.com/office/word/2023/wordml/word16du" xmlns:w16sdtdh="http://schemas.microsoft.com/office/word/2020/wordml/sdtdatahash" xmlns:w16sdtfl="http://schemas.microsoft.com/office/word/2024/wordml/sdtformatlock" xmlns:w16se="http://schemas.microsoft.com/office/word/2015/wordml/symex" xmlns:wpg="http://schemas.microsoft.com/office/word/2010/wordprocessingGroup" xmlns:wpi="http://schemas.microsoft.com/office/word/2010/wordprocessingInk" xmlns:wne="http://schemas.microsoft.com/office/word/2006/wordml" xmlns:wps="http://schemas.microsoft.com/office/word/2010/wordprocessingShape" mc:Ignorable="w14 w15 w16se w16cid w16 w16cex w16sdtdh w16sdtfl w16du wp14">
+<w:document xmlns:wpc="http://schemas.microsoft.com/office/word/2010/wordprocessingCanvas" xmlns:cx="http://schemas.microsoft.com/office/drawing/2014/chartex" xmlns:cx1="http://schemas.microsoft.com/office/drawing/2015/9/8/chartex" xmlns:cx2="http://schemas.microsoft.com/office/drawing/2015/10/21/chartex" xmlns:cx3="http://schemas.microsoft.com/office/drawing/2016/5/9/chartex" xmlns:cx4="http://schemas.microsoft.com/office/drawing/2016/5/10/chartex" xmlns:cx5="http://schemas.microsoft.com/office/drawing/2016/5/11/chartex" xmlns:cx6="http://schemas.microsoft.com/office/drawing/2016/5/12/chartex" xmlns:cx7="http://schemas.microsoft.com/office/drawing/2016/5/13/chartex" xmlns:cx8="http://schemas.microsoft.com/office/drawing/2016/5/14/chartex" xmlns:mc="http://schemas.openxmlformats.org/markup-compatibility/2006" xmlns:m="http://schemas.openxmlformats.org/officeDocument/2006/math" xmlns:aink="http://schemas.microsoft.com/office/drawing/2016/ink" xmlns:am3d="http://schemas.microsoft.com/office/drawing/2017/model3d" xmlns:oel="http://schemas.microsoft.com/office/2019/extlst" xmlns:r="http://schemas.openxmlformats.org/officeDocument/2006/relationships" xmlns:wp14="http://schemas.microsoft.com/office/word/2010/wordprocessingDrawing" xmlns:wp="http://schemas.openxmlformats.org/drawingml/2006/wordprocessingDrawing" xmlns:wpg="http://schemas.microsoft.com/office/word/2010/wordprocessingGroup" xmlns:wpi="http://schemas.microsoft.com/office/word/2010/wordprocessingInk" xmlns:wps="http://schemas.microsoft.com/office/word/2010/wordprocessingShape" xmlns:o="urn:schemas-microsoft-com:office:office" xmlns:v="urn:schemas-microsoft-com:vml" xmlns:w10="urn:schemas-microsoft-com:office:word" xmlns:w="http://schemas.openxmlformats.org/wordprocessingml/2006/main" xmlns:w14="http://schemas.microsoft.com/office/word/2010/wordml" xmlns:w15="http://schemas.microsoft.com/office/word/2012/wordml" xmlns:w16cex="http://schemas.microsoft.com/office/word/2018/wordml/cex" xmlns:w16cid="http://schemas.microsoft.com/office/word/2016/wordml/cid" xmlns:w16="http://schemas.microsoft.com/office/word/2018/wordml" xmlns:w16sdtdh="http://schemas.microsoft.com/office/word/2020/wordml/sdtdatahash" xmlns:w16sdtfl="http://schemas.microsoft.com/office/word/2024/wordml/sdtformatlock" xmlns:w16se="http://schemas.microsoft.com/office/word/2015/wordml/symex" xmlns:w16du="http://schemas.microsoft.com/office/word/2023/wordml/word16du" xmlns:wne="http://schemas.microsoft.com/office/word/2006/wordml" mc:Ignorable="w14 w15 w16se w16cid w16 w16cex w16sdtdh w16sdtfl w16du wp14">
   <w:body>
     <w:tbl>
       <w:tblPr>
@@ -55,6 +55,14 @@
                 <w:szCs w:val="20"/>
               </w:rPr>
             </w:pPr>
+            <w:r>
+              <w:rPr>
+                <w:rFonts w:ascii="Arial" w:hAnsi="Arial" w:cs="Arial"/>
+                <w:sz w:val="20"/>
+                <w:szCs w:val="20"/>
+              </w:rPr>
+              <w:t>Alexander- Team Leader</w:t>
+            </w:r>
           </w:p>
         </w:tc>
       </w:tr>
@@ -100,6 +108,14 @@
                 <w:szCs w:val="20"/>
               </w:rPr>
             </w:pPr>
+            <w:r>
+              <w:rPr>
+                <w:rFonts w:ascii="Arial" w:hAnsi="Arial" w:cs="Arial"/>
+                <w:sz w:val="20"/>
+                <w:szCs w:val="20"/>
+              </w:rPr>
+              <w:t>Max- Developer 1</w:t>
+            </w:r>
           </w:p>
         </w:tc>
       </w:tr>
@@ -145,6 +161,14 @@
                 <w:szCs w:val="20"/>
               </w:rPr>
             </w:pPr>
+            <w:r>
+              <w:rPr>
+                <w:rFonts w:ascii="Arial" w:hAnsi="Arial" w:cs="Arial"/>
+                <w:sz w:val="20"/>
+                <w:szCs w:val="20"/>
+              </w:rPr>
+              <w:t>Aftab- Developer 2</w:t>
+            </w:r>
           </w:p>
         </w:tc>
       </w:tr>
@@ -190,6 +214,14 @@
                 <w:szCs w:val="20"/>
               </w:rPr>
             </w:pPr>
+            <w:r>
+              <w:rPr>
+                <w:rFonts w:ascii="Arial" w:hAnsi="Arial" w:cs="Arial"/>
+                <w:sz w:val="20"/>
+                <w:szCs w:val="20"/>
+              </w:rPr>
+              <w:t>Jordan- Developer 3</w:t>
+            </w:r>
           </w:p>
         </w:tc>
       </w:tr>
@@ -1006,6 +1038,9 @@
           </w:tcPr>
           <w:p>
             <w:r>
+              <w:t>Yes</w:t>
+            </w:r>
+            <w:r>
               <w:rPr>
                 <w:noProof/>
               </w:rPr>
@@ -1127,6 +1162,9 @@
           </w:tcPr>
           <w:p>
             <w:r>
+              <w:t>Yes</w:t>
+            </w:r>
+            <w:r>
               <w:rPr>
                 <w:noProof/>
               </w:rPr>
@@ -1249,6 +1287,9 @@
           </w:tcPr>
           <w:p>
             <w:r>
+              <w:t>Yes</w:t>
+            </w:r>
+            <w:r>
               <w:rPr>
                 <w:noProof/>
               </w:rPr>
@@ -1342,25 +1383,7 @@
                 <w:color w:val="000000"/>
                 <w:sz w:val="18"/>
               </w:rPr>
-              <w:t xml:space="preserve">The page </w:t>
-            </w:r>
-            <w:proofErr w:type="gramStart"/>
-            <w:r>
-              <w:rPr>
-                <w:rFonts w:ascii="Arial" w:hAnsi="Arial"/>
-                <w:color w:val="000000"/>
-                <w:sz w:val="18"/>
-              </w:rPr>
-              <w:t>displays with</w:t>
-            </w:r>
-            <w:proofErr w:type="gramEnd"/>
-            <w:r>
-              <w:rPr>
-                <w:rFonts w:ascii="Arial" w:hAnsi="Arial"/>
-                <w:color w:val="000000"/>
-                <w:sz w:val="18"/>
-              </w:rPr>
-              <w:t xml:space="preserve"> its intended CSS and no broken images or missing layout elements.</w:t>
+              <w:t>The page displays with its intended CSS and no broken images or missing layout elements.</w:t>
             </w:r>
           </w:p>
         </w:tc>
@@ -1382,6 +1405,9 @@
             <w:tcW w:w="2052" w:type="dxa"/>
           </w:tcPr>
           <w:p>
+            <w:r>
+              <w:t>Yes</w:t>
+            </w:r>
             <w:r>
               <w:rPr>
                 <w:noProof/>
@@ -1501,6 +1527,9 @@
           </w:tcPr>
           <w:p>
             <w:r>
+              <w:t>Yes</w:t>
+            </w:r>
+            <w:r>
               <w:rPr>
                 <w:noProof/>
               </w:rPr>
@@ -1576,15 +1605,7 @@
           </w:tcPr>
           <w:p>
             <w:r>
-              <w:t xml:space="preserve">The Moffat Bay Marina landing page </w:t>
-            </w:r>
-            <w:proofErr w:type="gramStart"/>
-            <w:r>
-              <w:t>loaded</w:t>
-            </w:r>
-            <w:proofErr w:type="gramEnd"/>
-            <w:r>
-              <w:t xml:space="preserve"> successfully through Tomcat and remained accessible without requiring authentication. All expected content, navigation, styling, images, and footer elements displayed correctly after correcting the image resource paths. The page also reloaded successfully and remained fully functional after refresh.</w:t>
+              <w:t>The Moffat Bay Marina landing page loaded successfully through Tomcat and remained accessible without requiring authentication. All expected content, navigation, styling, images, and footer elements displayed correctly after correcting the image resource paths. The page also reloaded successfully and remained fully functional after refresh.</w:t>
             </w:r>
           </w:p>
         </w:tc>
@@ -1953,25 +1974,7 @@
                 <w:color w:val="000000"/>
                 <w:sz w:val="18"/>
               </w:rPr>
-              <w:t xml:space="preserve">The landing page loads and the navigation menu </w:t>
-            </w:r>
-            <w:proofErr w:type="gramStart"/>
-            <w:r>
-              <w:rPr>
-                <w:rFonts w:ascii="Arial" w:hAnsi="Arial"/>
-                <w:color w:val="000000"/>
-                <w:sz w:val="18"/>
-              </w:rPr>
-              <w:t>is</w:t>
-            </w:r>
-            <w:proofErr w:type="gramEnd"/>
-            <w:r>
-              <w:rPr>
-                <w:rFonts w:ascii="Arial" w:hAnsi="Arial"/>
-                <w:color w:val="000000"/>
-                <w:sz w:val="18"/>
-              </w:rPr>
-              <w:t xml:space="preserve"> visible.</w:t>
+              <w:t>The landing page loads and the navigation menu is visible.</w:t>
             </w:r>
           </w:p>
         </w:tc>
@@ -1999,12 +2002,15 @@
           </w:tcPr>
           <w:p>
             <w:r>
+              <w:t>Yes</w:t>
+            </w:r>
+            <w:r>
               <w:rPr>
                 <w:noProof/>
               </w:rPr>
               <w:drawing>
-                <wp:inline distT="0" distB="0" distL="0" distR="0" wp14:anchorId="668F13B1" wp14:editId="608E11CD">
-                  <wp:extent cx="1316533" cy="822325"/>
+                <wp:inline distT="0" distB="0" distL="0" distR="0" wp14:anchorId="668F13B1" wp14:editId="18C7F5D7">
+                  <wp:extent cx="1463944" cy="914400"/>
                   <wp:effectExtent l="0" t="0" r="0" b="0"/>
                   <wp:docPr id="1756037022" name="Picture 8"/>
                   <wp:cNvGraphicFramePr>
@@ -2032,7 +2038,7 @@
                         <pic:spPr>
                           <a:xfrm>
                             <a:off x="0" y="0"/>
-                            <a:ext cx="1329282" cy="830288"/>
+                            <a:ext cx="1483970" cy="926908"/>
                           </a:xfrm>
                           <a:prstGeom prst="rect">
                             <a:avLst/>
@@ -2116,6 +2122,9 @@
             <w:tcW w:w="2052" w:type="dxa"/>
           </w:tcPr>
           <w:p>
+            <w:r>
+              <w:t>Yes</w:t>
+            </w:r>
             <w:r>
               <w:rPr>
                 <w:noProof/>
@@ -2233,6 +2242,9 @@
           </w:tcPr>
           <w:p>
             <w:r>
+              <w:t>Yes</w:t>
+            </w:r>
+            <w:r>
               <w:rPr>
                 <w:noProof/>
               </w:rPr>
@@ -2349,6 +2361,9 @@
           </w:tcPr>
           <w:p>
             <w:r>
+              <w:t>Yes</w:t>
+            </w:r>
+            <w:r>
               <w:rPr>
                 <w:noProof/>
               </w:rPr>
@@ -2466,6 +2481,9 @@
           </w:tcPr>
           <w:p>
             <w:r>
+              <w:t>Yes</w:t>
+            </w:r>
+            <w:r>
               <w:rPr>
                 <w:noProof/>
               </w:rPr>
@@ -2938,25 +2956,7 @@
                 <w:color w:val="000000"/>
                 <w:sz w:val="18"/>
               </w:rPr>
-              <w:t xml:space="preserve">The Login page displays email and password fields and </w:t>
-            </w:r>
-            <w:proofErr w:type="gramStart"/>
-            <w:r>
-              <w:rPr>
-                <w:rFonts w:ascii="Arial" w:hAnsi="Arial"/>
-                <w:color w:val="000000"/>
-                <w:sz w:val="18"/>
-              </w:rPr>
-              <w:t>a login</w:t>
-            </w:r>
-            <w:proofErr w:type="gramEnd"/>
-            <w:r>
-              <w:rPr>
-                <w:rFonts w:ascii="Arial" w:hAnsi="Arial"/>
-                <w:color w:val="000000"/>
-                <w:sz w:val="18"/>
-              </w:rPr>
-              <w:t xml:space="preserve"> control.</w:t>
+              <w:t>The Login page displays email and password fields and a login control.</w:t>
             </w:r>
           </w:p>
         </w:tc>
@@ -4629,12 +4629,12 @@
       </w:tblPr>
       <w:tblGrid>
         <w:gridCol w:w="1250"/>
-        <w:gridCol w:w="3177"/>
+        <w:gridCol w:w="3175"/>
         <w:gridCol w:w="298"/>
-        <w:gridCol w:w="3210"/>
+        <w:gridCol w:w="3209"/>
         <w:gridCol w:w="623"/>
         <w:gridCol w:w="1360"/>
-        <w:gridCol w:w="746"/>
+        <w:gridCol w:w="749"/>
         <w:gridCol w:w="2286"/>
       </w:tblGrid>
       <w:tr>
@@ -5055,15 +5055,7 @@
                 <w:color w:val="FF0000"/>
                 <w:sz w:val="18"/>
               </w:rPr>
-              <w:t>Y</w:t>
-            </w:r>
-            <w:r>
-              <w:rPr>
-                <w:rFonts w:ascii="Arial" w:hAnsi="Arial"/>
-                <w:color w:val="FF0000"/>
-                <w:sz w:val="18"/>
-              </w:rPr>
-              <w:t>es</w:t>
+              <w:t>Yes</w:t>
             </w:r>
           </w:p>
           <w:p>
@@ -5196,9 +5188,9 @@
                 <w:noProof/>
               </w:rPr>
               <w:drawing>
-                <wp:inline distT="0" distB="0" distL="0" distR="0" wp14:anchorId="2A74A4C5" wp14:editId="200A0F64">
-                  <wp:extent cx="1382805" cy="731520"/>
-                  <wp:effectExtent l="0" t="0" r="8255" b="0"/>
+                <wp:inline distT="0" distB="0" distL="0" distR="0" wp14:anchorId="2A74A4C5" wp14:editId="64ADF37C">
+                  <wp:extent cx="1693231" cy="895739"/>
+                  <wp:effectExtent l="0" t="0" r="0" b="6350"/>
                   <wp:docPr id="902509273" name="Picture 4"/>
                   <wp:cNvGraphicFramePr>
                     <a:graphicFrameLocks xmlns:a="http://schemas.openxmlformats.org/drawingml/2006/main" noChangeAspect="1"/>
@@ -5225,7 +5217,7 @@
                         <pic:spPr>
                           <a:xfrm>
                             <a:off x="0" y="0"/>
-                            <a:ext cx="1382805" cy="731520"/>
+                            <a:ext cx="1708840" cy="903997"/>
                           </a:xfrm>
                           <a:prstGeom prst="rect">
                             <a:avLst/>
@@ -5320,15 +5312,7 @@
                 <w:color w:val="FF0000"/>
                 <w:sz w:val="18"/>
               </w:rPr>
-              <w:t>Y</w:t>
-            </w:r>
-            <w:r>
-              <w:rPr>
-                <w:rFonts w:ascii="Arial" w:hAnsi="Arial"/>
-                <w:color w:val="FF0000"/>
-                <w:sz w:val="18"/>
-              </w:rPr>
-              <w:t>es</w:t>
+              <w:t>Yes</w:t>
             </w:r>
           </w:p>
           <w:p>
@@ -5479,15 +5463,7 @@
                 <w:color w:val="FF0000"/>
                 <w:sz w:val="18"/>
               </w:rPr>
-              <w:t>Y</w:t>
-            </w:r>
-            <w:r>
-              <w:rPr>
-                <w:rFonts w:ascii="Arial" w:hAnsi="Arial"/>
-                <w:color w:val="FF0000"/>
-                <w:sz w:val="18"/>
-              </w:rPr>
-              <w:t>es</w:t>
+              <w:t>Yes</w:t>
             </w:r>
           </w:p>
           <w:p>
@@ -5586,25 +5562,7 @@
                 <w:color w:val="000000"/>
                 <w:sz w:val="18"/>
               </w:rPr>
-              <w:t xml:space="preserve">One customer record and its associated boat record are created, and the user is directed </w:t>
-            </w:r>
-            <w:proofErr w:type="gramStart"/>
-            <w:r>
-              <w:rPr>
-                <w:rFonts w:ascii="Arial" w:hAnsi="Arial"/>
-                <w:color w:val="000000"/>
-                <w:sz w:val="18"/>
-              </w:rPr>
-              <w:t>to</w:t>
-            </w:r>
-            <w:proofErr w:type="gramEnd"/>
-            <w:r>
-              <w:rPr>
-                <w:rFonts w:ascii="Arial" w:hAnsi="Arial"/>
-                <w:color w:val="000000"/>
-                <w:sz w:val="18"/>
-              </w:rPr>
-              <w:t xml:space="preserve"> email verification.</w:t>
+              <w:t>One customer record and its associated boat record are created, and the user is directed to email verification.</w:t>
             </w:r>
           </w:p>
         </w:tc>
@@ -5643,15 +5601,7 @@
                 <w:color w:val="FF0000"/>
                 <w:sz w:val="18"/>
               </w:rPr>
-              <w:t>Y</w:t>
-            </w:r>
-            <w:r>
-              <w:rPr>
-                <w:rFonts w:ascii="Arial" w:hAnsi="Arial"/>
-                <w:color w:val="FF0000"/>
-                <w:sz w:val="18"/>
-              </w:rPr>
-              <w:t>es</w:t>
+              <w:t>Yes</w:t>
             </w:r>
           </w:p>
           <w:p>
@@ -5720,6 +5670,7 @@
                 <w:color w:val="000000"/>
                 <w:sz w:val="20"/>
               </w:rPr>
+              <w:lastRenderedPageBreak/>
               <w:t>Comments</w:t>
             </w:r>
           </w:p>
@@ -5744,25 +5695,7 @@
                 <w:color w:val="FF0000"/>
                 <w:sz w:val="18"/>
               </w:rPr>
-              <w:t xml:space="preserve">Needed to add fields for the users address that the servlet for registration required. As these were required fields. I added scripts to the client-side html file. Removed the JS link. Also added fields for the boat info. There </w:t>
-            </w:r>
-            <w:proofErr w:type="gramStart"/>
-            <w:r>
-              <w:rPr>
-                <w:rFonts w:ascii="Arial" w:hAnsi="Arial"/>
-                <w:color w:val="FF0000"/>
-                <w:sz w:val="18"/>
-              </w:rPr>
-              <w:t>is</w:t>
-            </w:r>
-            <w:proofErr w:type="gramEnd"/>
-            <w:r>
-              <w:rPr>
-                <w:rFonts w:ascii="Arial" w:hAnsi="Arial"/>
-                <w:color w:val="FF0000"/>
-                <w:sz w:val="18"/>
-              </w:rPr>
-              <w:t xml:space="preserve"> also </w:t>
+              <w:t xml:space="preserve">Needed to add fields for the users address that the servlet for registration required. As these were required fields. I added scripts to the client-side html file. Removed the JS link. Also added fields for the boat info. There is also </w:t>
             </w:r>
             <w:proofErr w:type="spellStart"/>
             <w:r>
@@ -5795,7 +5728,6 @@
           </w:tcPr>
           <w:p>
             <w:r>
-              <w:lastRenderedPageBreak/>
               <w:br w:type="page"/>
             </w:r>
             <w:r>
@@ -6371,25 +6303,7 @@
                 <w:color w:val="000000"/>
                 <w:sz w:val="18"/>
               </w:rPr>
-              <w:t xml:space="preserve">Complete all other required </w:t>
-            </w:r>
-            <w:proofErr w:type="gramStart"/>
-            <w:r>
-              <w:rPr>
-                <w:rFonts w:ascii="Arial" w:hAnsi="Arial"/>
-                <w:color w:val="000000"/>
-                <w:sz w:val="18"/>
-              </w:rPr>
-              <w:t>customer</w:t>
-            </w:r>
-            <w:proofErr w:type="gramEnd"/>
-            <w:r>
-              <w:rPr>
-                <w:rFonts w:ascii="Arial" w:hAnsi="Arial"/>
-                <w:color w:val="000000"/>
-                <w:sz w:val="18"/>
-              </w:rPr>
-              <w:t>, password, and boat fields with valid data.</w:t>
+              <w:t>Complete all other required customer, password, and boat fields with valid data.</w:t>
             </w:r>
           </w:p>
         </w:tc>
@@ -6436,23 +6350,7 @@
                 <w:color w:val="FF0000"/>
                 <w:sz w:val="18"/>
               </w:rPr>
-              <w:t>Y</w:t>
-            </w:r>
-            <w:r>
-              <w:rPr>
-                <w:rFonts w:ascii="Arial" w:hAnsi="Arial"/>
-                <w:color w:val="FF0000"/>
-                <w:sz w:val="18"/>
-              </w:rPr>
-              <w:t>es</w:t>
-            </w:r>
-            <w:r>
-              <w:rPr>
-                <w:rFonts w:ascii="Arial" w:hAnsi="Arial"/>
-                <w:color w:val="FF0000"/>
-                <w:sz w:val="18"/>
-              </w:rPr>
-              <w:t xml:space="preserve">: see image above. A different address was entered and the duplicate email was the only fault that trigger none duplication. </w:t>
+              <w:t xml:space="preserve">Yes: see image above. A different address was entered and the duplicate email was the only fault that trigger none duplication. </w:t>
             </w:r>
           </w:p>
         </w:tc>
@@ -6498,7 +6396,6 @@
             <w:gridSpan w:val="2"/>
           </w:tcPr>
           <w:p>
-            <w:proofErr w:type="gramStart"/>
             <w:r>
               <w:rPr>
                 <w:rFonts w:ascii="Arial" w:hAnsi="Arial"/>
@@ -6517,32 +6414,13 @@
               <w:t>RegisterServlet</w:t>
             </w:r>
             <w:proofErr w:type="spellEnd"/>
-            <w:proofErr w:type="gramEnd"/>
-            <w:r>
-              <w:rPr>
-                <w:rFonts w:ascii="Arial" w:hAnsi="Arial"/>
-                <w:color w:val="000000"/>
-                <w:sz w:val="18"/>
-              </w:rPr>
-              <w:t xml:space="preserve"> detects </w:t>
-            </w:r>
-            <w:proofErr w:type="gramStart"/>
-            <w:r>
-              <w:rPr>
-                <w:rFonts w:ascii="Arial" w:hAnsi="Arial"/>
-                <w:color w:val="000000"/>
-                <w:sz w:val="18"/>
-              </w:rPr>
-              <w:t>the duplicate</w:t>
-            </w:r>
-            <w:proofErr w:type="gramEnd"/>
-            <w:r>
-              <w:rPr>
-                <w:rFonts w:ascii="Arial" w:hAnsi="Arial"/>
-                <w:color w:val="000000"/>
-                <w:sz w:val="18"/>
-              </w:rPr>
-              <w:t xml:space="preserve"> email and rejects the registration.</w:t>
+            <w:r>
+              <w:rPr>
+                <w:rFonts w:ascii="Arial" w:hAnsi="Arial"/>
+                <w:color w:val="000000"/>
+                <w:sz w:val="18"/>
+              </w:rPr>
+              <w:t xml:space="preserve"> detects the duplicate email and rejects the registration.</w:t>
             </w:r>
           </w:p>
         </w:tc>
@@ -6787,6 +6665,7 @@
                 <w:color w:val="000000"/>
                 <w:sz w:val="20"/>
               </w:rPr>
+              <w:lastRenderedPageBreak/>
               <w:t>Comments</w:t>
             </w:r>
           </w:p>
@@ -6843,7 +6722,7 @@
 </file>
 
 <file path=word/endnotes.xml><?xml version="1.0" encoding="utf-8"?>
-<w:endnotes xmlns:wpc="http://schemas.microsoft.com/office/word/2010/wordprocessingCanvas" xmlns:cx="http://schemas.microsoft.com/office/drawing/2014/chartex" xmlns:cx1="http://schemas.microsoft.com/office/drawing/2015/9/8/chartex" xmlns:cx2="http://schemas.microsoft.com/office/drawing/2015/10/21/chartex" xmlns:cx3="http://schemas.microsoft.com/office/drawing/2016/5/9/chartex" xmlns:cx4="http://schemas.microsoft.com/office/drawing/2016/5/10/chartex" xmlns:cx5="http://schemas.microsoft.com/office/drawing/2016/5/11/chartex" xmlns:cx6="http://schemas.microsoft.com/office/drawing/2016/5/12/chartex" xmlns:cx7="http://schemas.microsoft.com/office/drawing/2016/5/13/chartex" xmlns:cx8="http://schemas.microsoft.com/office/drawing/2016/5/14/chartex" xmlns:mc="http://schemas.openxmlformats.org/markup-compatibility/2006" xmlns:aink="http://schemas.microsoft.com/office/drawing/2016/ink" xmlns:am3d="http://schemas.microsoft.com/office/drawing/2017/model3d" xmlns:o="urn:schemas-microsoft-com:office:office" xmlns:oel="http://schemas.microsoft.com/office/2019/extlst" xmlns:r="http://schemas.openxmlformats.org/officeDocument/2006/relationships" xmlns:m="http://schemas.openxmlformats.org/officeDocument/2006/math" xmlns:v="urn:schemas-microsoft-com:vml" xmlns:wp14="http://schemas.microsoft.com/office/word/2010/wordprocessingDrawing" xmlns:wp="http://schemas.openxmlformats.org/drawingml/2006/wordprocessingDrawing" xmlns:w10="urn:schemas-microsoft-com:office:word" xmlns:w="http://schemas.openxmlformats.org/wordprocessingml/2006/main" xmlns:w14="http://schemas.microsoft.com/office/word/2010/wordml" xmlns:w15="http://schemas.microsoft.com/office/word/2012/wordml" xmlns:w16cex="http://schemas.microsoft.com/office/word/2018/wordml/cex" xmlns:w16cid="http://schemas.microsoft.com/office/word/2016/wordml/cid" xmlns:w16="http://schemas.microsoft.com/office/word/2018/wordml" xmlns:w16du="http://schemas.microsoft.com/office/word/2023/wordml/word16du" xmlns:w16sdtdh="http://schemas.microsoft.com/office/word/2020/wordml/sdtdatahash" xmlns:w16sdtfl="http://schemas.microsoft.com/office/word/2024/wordml/sdtformatlock" xmlns:w16se="http://schemas.microsoft.com/office/word/2015/wordml/symex" xmlns:wpg="http://schemas.microsoft.com/office/word/2010/wordprocessingGroup" xmlns:wpi="http://schemas.microsoft.com/office/word/2010/wordprocessingInk" xmlns:wne="http://schemas.microsoft.com/office/word/2006/wordml" xmlns:wps="http://schemas.microsoft.com/office/word/2010/wordprocessingShape" mc:Ignorable="w14 w15 w16se w16cid w16 w16cex w16sdtdh w16sdtfl w16du wp14">
+<w:endnotes xmlns:wpc="http://schemas.microsoft.com/office/word/2010/wordprocessingCanvas" xmlns:cx="http://schemas.microsoft.com/office/drawing/2014/chartex" xmlns:cx1="http://schemas.microsoft.com/office/drawing/2015/9/8/chartex" xmlns:cx2="http://schemas.microsoft.com/office/drawing/2015/10/21/chartex" xmlns:cx3="http://schemas.microsoft.com/office/drawing/2016/5/9/chartex" xmlns:cx4="http://schemas.microsoft.com/office/drawing/2016/5/10/chartex" xmlns:cx5="http://schemas.microsoft.com/office/drawing/2016/5/11/chartex" xmlns:cx6="http://schemas.microsoft.com/office/drawing/2016/5/12/chartex" xmlns:cx7="http://schemas.microsoft.com/office/drawing/2016/5/13/chartex" xmlns:cx8="http://schemas.microsoft.com/office/drawing/2016/5/14/chartex" xmlns:mc="http://schemas.openxmlformats.org/markup-compatibility/2006" xmlns:m="http://schemas.openxmlformats.org/officeDocument/2006/math" xmlns:aink="http://schemas.microsoft.com/office/drawing/2016/ink" xmlns:am3d="http://schemas.microsoft.com/office/drawing/2017/model3d" xmlns:oel="http://schemas.microsoft.com/office/2019/extlst" xmlns:r="http://schemas.openxmlformats.org/officeDocument/2006/relationships" xmlns:wp14="http://schemas.microsoft.com/office/word/2010/wordprocessingDrawing" xmlns:wp="http://schemas.openxmlformats.org/drawingml/2006/wordprocessingDrawing" xmlns:wpg="http://schemas.microsoft.com/office/word/2010/wordprocessingGroup" xmlns:wpi="http://schemas.microsoft.com/office/word/2010/wordprocessingInk" xmlns:wps="http://schemas.microsoft.com/office/word/2010/wordprocessingShape" xmlns:o="urn:schemas-microsoft-com:office:office" xmlns:v="urn:schemas-microsoft-com:vml" xmlns:w10="urn:schemas-microsoft-com:office:word" xmlns:w="http://schemas.openxmlformats.org/wordprocessingml/2006/main" xmlns:w14="http://schemas.microsoft.com/office/word/2010/wordml" xmlns:w15="http://schemas.microsoft.com/office/word/2012/wordml" xmlns:w16cex="http://schemas.microsoft.com/office/word/2018/wordml/cex" xmlns:w16cid="http://schemas.microsoft.com/office/word/2016/wordml/cid" xmlns:w16="http://schemas.microsoft.com/office/word/2018/wordml" xmlns:w16sdtdh="http://schemas.microsoft.com/office/word/2020/wordml/sdtdatahash" xmlns:w16sdtfl="http://schemas.microsoft.com/office/word/2024/wordml/sdtformatlock" xmlns:w16se="http://schemas.microsoft.com/office/word/2015/wordml/symex" xmlns:w16du="http://schemas.microsoft.com/office/word/2023/wordml/word16du" xmlns:wne="http://schemas.microsoft.com/office/word/2006/wordml" mc:Ignorable="w14 w15 w16se w16cid w16 w16cex w16sdtdh w16sdtfl w16du wp14">
   <w:endnote w:type="separator" w:id="-1">
     <w:p>
       <w:pPr>
@@ -6868,7 +6747,7 @@
 </file>
 
 <file path=word/footer1.xml><?xml version="1.0" encoding="utf-8"?>
-<w:ftr xmlns:wpc="http://schemas.microsoft.com/office/word/2010/wordprocessingCanvas" xmlns:cx="http://schemas.microsoft.com/office/drawing/2014/chartex" xmlns:cx1="http://schemas.microsoft.com/office/drawing/2015/9/8/chartex" xmlns:cx2="http://schemas.microsoft.com/office/drawing/2015/10/21/chartex" xmlns:cx3="http://schemas.microsoft.com/office/drawing/2016/5/9/chartex" xmlns:cx4="http://schemas.microsoft.com/office/drawing/2016/5/10/chartex" xmlns:cx5="http://schemas.microsoft.com/office/drawing/2016/5/11/chartex" xmlns:cx6="http://schemas.microsoft.com/office/drawing/2016/5/12/chartex" xmlns:cx7="http://schemas.microsoft.com/office/drawing/2016/5/13/chartex" xmlns:cx8="http://schemas.microsoft.com/office/drawing/2016/5/14/chartex" xmlns:mc="http://schemas.openxmlformats.org/markup-compatibility/2006" xmlns:aink="http://schemas.microsoft.com/office/drawing/2016/ink" xmlns:am3d="http://schemas.microsoft.com/office/drawing/2017/model3d" xmlns:o="urn:schemas-microsoft-com:office:office" xmlns:oel="http://schemas.microsoft.com/office/2019/extlst" xmlns:r="http://schemas.openxmlformats.org/officeDocument/2006/relationships" xmlns:m="http://schemas.openxmlformats.org/officeDocument/2006/math" xmlns:v="urn:schemas-microsoft-com:vml" xmlns:wp14="http://schemas.microsoft.com/office/word/2010/wordprocessingDrawing" xmlns:wp="http://schemas.openxmlformats.org/drawingml/2006/wordprocessingDrawing" xmlns:w10="urn:schemas-microsoft-com:office:word" xmlns:w="http://schemas.openxmlformats.org/wordprocessingml/2006/main" xmlns:w14="http://schemas.microsoft.com/office/word/2010/wordml" xmlns:w15="http://schemas.microsoft.com/office/word/2012/wordml" xmlns:w16cex="http://schemas.microsoft.com/office/word/2018/wordml/cex" xmlns:w16cid="http://schemas.microsoft.com/office/word/2016/wordml/cid" xmlns:w16="http://schemas.microsoft.com/office/word/2018/wordml" xmlns:w16du="http://schemas.microsoft.com/office/word/2023/wordml/word16du" xmlns:w16sdtdh="http://schemas.microsoft.com/office/word/2020/wordml/sdtdatahash" xmlns:w16sdtfl="http://schemas.microsoft.com/office/word/2024/wordml/sdtformatlock" xmlns:w16se="http://schemas.microsoft.com/office/word/2015/wordml/symex" xmlns:wpg="http://schemas.microsoft.com/office/word/2010/wordprocessingGroup" xmlns:wpi="http://schemas.microsoft.com/office/word/2010/wordprocessingInk" xmlns:wne="http://schemas.microsoft.com/office/word/2006/wordml" xmlns:wps="http://schemas.microsoft.com/office/word/2010/wordprocessingShape" mc:Ignorable="w14 w15 w16se w16cid w16 w16cex w16sdtdh w16sdtfl w16du wp14">
+<w:ftr xmlns:wpc="http://schemas.microsoft.com/office/word/2010/wordprocessingCanvas" xmlns:cx="http://schemas.microsoft.com/office/drawing/2014/chartex" xmlns:cx1="http://schemas.microsoft.com/office/drawing/2015/9/8/chartex" xmlns:cx2="http://schemas.microsoft.com/office/drawing/2015/10/21/chartex" xmlns:cx3="http://schemas.microsoft.com/office/drawing/2016/5/9/chartex" xmlns:cx4="http://schemas.microsoft.com/office/drawing/2016/5/10/chartex" xmlns:cx5="http://schemas.microsoft.com/office/drawing/2016/5/11/chartex" xmlns:cx6="http://schemas.microsoft.com/office/drawing/2016/5/12/chartex" xmlns:cx7="http://schemas.microsoft.com/office/drawing/2016/5/13/chartex" xmlns:cx8="http://schemas.microsoft.com/office/drawing/2016/5/14/chartex" xmlns:mc="http://schemas.openxmlformats.org/markup-compatibility/2006" xmlns:m="http://schemas.openxmlformats.org/officeDocument/2006/math" xmlns:aink="http://schemas.microsoft.com/office/drawing/2016/ink" xmlns:am3d="http://schemas.microsoft.com/office/drawing/2017/model3d" xmlns:oel="http://schemas.microsoft.com/office/2019/extlst" xmlns:r="http://schemas.openxmlformats.org/officeDocument/2006/relationships" xmlns:wp14="http://schemas.microsoft.com/office/word/2010/wordprocessingDrawing" xmlns:wp="http://schemas.openxmlformats.org/drawingml/2006/wordprocessingDrawing" xmlns:wpg="http://schemas.microsoft.com/office/word/2010/wordprocessingGroup" xmlns:wpi="http://schemas.microsoft.com/office/word/2010/wordprocessingInk" xmlns:wps="http://schemas.microsoft.com/office/word/2010/wordprocessingShape" xmlns:o="urn:schemas-microsoft-com:office:office" xmlns:v="urn:schemas-microsoft-com:vml" xmlns:w10="urn:schemas-microsoft-com:office:word" xmlns:w="http://schemas.openxmlformats.org/wordprocessingml/2006/main" xmlns:w14="http://schemas.microsoft.com/office/word/2010/wordml" xmlns:w15="http://schemas.microsoft.com/office/word/2012/wordml" xmlns:w16cex="http://schemas.microsoft.com/office/word/2018/wordml/cex" xmlns:w16cid="http://schemas.microsoft.com/office/word/2016/wordml/cid" xmlns:w16="http://schemas.microsoft.com/office/word/2018/wordml" xmlns:w16sdtdh="http://schemas.microsoft.com/office/word/2020/wordml/sdtdatahash" xmlns:w16sdtfl="http://schemas.microsoft.com/office/word/2024/wordml/sdtformatlock" xmlns:w16se="http://schemas.microsoft.com/office/word/2015/wordml/symex" xmlns:w16du="http://schemas.microsoft.com/office/word/2023/wordml/word16du" xmlns:wne="http://schemas.microsoft.com/office/word/2006/wordml" mc:Ignorable="w14 w15 w16se w16cid w16 w16cex w16sdtdh w16sdtfl w16du wp14">
   <w:p>
     <w:pPr>
       <w:pStyle w:val="Footer"/>
@@ -7005,7 +6884,7 @@
 </file>
 
 <file path=word/footnotes.xml><?xml version="1.0" encoding="utf-8"?>
-<w:footnotes xmlns:wpc="http://schemas.microsoft.com/office/word/2010/wordprocessingCanvas" xmlns:cx="http://schemas.microsoft.com/office/drawing/2014/chartex" xmlns:cx1="http://schemas.microsoft.com/office/drawing/2015/9/8/chartex" xmlns:cx2="http://schemas.microsoft.com/office/drawing/2015/10/21/chartex" xmlns:cx3="http://schemas.microsoft.com/office/drawing/2016/5/9/chartex" xmlns:cx4="http://schemas.microsoft.com/office/drawing/2016/5/10/chartex" xmlns:cx5="http://schemas.microsoft.com/office/drawing/2016/5/11/chartex" xmlns:cx6="http://schemas.microsoft.com/office/drawing/2016/5/12/chartex" xmlns:cx7="http://schemas.microsoft.com/office/drawing/2016/5/13/chartex" xmlns:cx8="http://schemas.microsoft.com/office/drawing/2016/5/14/chartex" xmlns:mc="http://schemas.openxmlformats.org/markup-compatibility/2006" xmlns:aink="http://schemas.microsoft.com/office/drawing/2016/ink" xmlns:am3d="http://schemas.microsoft.com/office/drawing/2017/model3d" xmlns:o="urn:schemas-microsoft-com:office:office" xmlns:oel="http://schemas.microsoft.com/office/2019/extlst" xmlns:r="http://schemas.openxmlformats.org/officeDocument/2006/relationships" xmlns:m="http://schemas.openxmlformats.org/officeDocument/2006/math" xmlns:v="urn:schemas-microsoft-com:vml" xmlns:wp14="http://schemas.microsoft.com/office/word/2010/wordprocessingDrawing" xmlns:wp="http://schemas.openxmlformats.org/drawingml/2006/wordprocessingDrawing" xmlns:w10="urn:schemas-microsoft-com:office:word" xmlns:w="http://schemas.openxmlformats.org/wordprocessingml/2006/main" xmlns:w14="http://schemas.microsoft.com/office/word/2010/wordml" xmlns:w15="http://schemas.microsoft.com/office/word/2012/wordml" xmlns:w16cex="http://schemas.microsoft.com/office/word/2018/wordml/cex" xmlns:w16cid="http://schemas.microsoft.com/office/word/2016/wordml/cid" xmlns:w16="http://schemas.microsoft.com/office/word/2018/wordml" xmlns:w16du="http://schemas.microsoft.com/office/word/2023/wordml/word16du" xmlns:w16sdtdh="http://schemas.microsoft.com/office/word/2020/wordml/sdtdatahash" xmlns:w16sdtfl="http://schemas.microsoft.com/office/word/2024/wordml/sdtformatlock" xmlns:w16se="http://schemas.microsoft.com/office/word/2015/wordml/symex" xmlns:wpg="http://schemas.microsoft.com/office/word/2010/wordprocessingGroup" xmlns:wpi="http://schemas.microsoft.com/office/word/2010/wordprocessingInk" xmlns:wne="http://schemas.microsoft.com/office/word/2006/wordml" xmlns:wps="http://schemas.microsoft.com/office/word/2010/wordprocessingShape" mc:Ignorable="w14 w15 w16se w16cid w16 w16cex w16sdtdh w16sdtfl w16du wp14">
+<w:footnotes xmlns:wpc="http://schemas.microsoft.com/office/word/2010/wordprocessingCanvas" xmlns:cx="http://schemas.microsoft.com/office/drawing/2014/chartex" xmlns:cx1="http://schemas.microsoft.com/office/drawing/2015/9/8/chartex" xmlns:cx2="http://schemas.microsoft.com/office/drawing/2015/10/21/chartex" xmlns:cx3="http://schemas.microsoft.com/office/drawing/2016/5/9/chartex" xmlns:cx4="http://schemas.microsoft.com/office/drawing/2016/5/10/chartex" xmlns:cx5="http://schemas.microsoft.com/office/drawing/2016/5/11/chartex" xmlns:cx6="http://schemas.microsoft.com/office/drawing/2016/5/12/chartex" xmlns:cx7="http://schemas.microsoft.com/office/drawing/2016/5/13/chartex" xmlns:cx8="http://schemas.microsoft.com/office/drawing/2016/5/14/chartex" xmlns:mc="http://schemas.openxmlformats.org/markup-compatibility/2006" xmlns:m="http://schemas.openxmlformats.org/officeDocument/2006/math" xmlns:aink="http://schemas.microsoft.com/office/drawing/2016/ink" xmlns:am3d="http://schemas.microsoft.com/office/drawing/2017/model3d" xmlns:oel="http://schemas.microsoft.com/office/2019/extlst" xmlns:r="http://schemas.openxmlformats.org/officeDocument/2006/relationships" xmlns:wp14="http://schemas.microsoft.com/office/word/2010/wordprocessingDrawing" xmlns:wp="http://schemas.openxmlformats.org/drawingml/2006/wordprocessingDrawing" xmlns:wpg="http://schemas.microsoft.com/office/word/2010/wordprocessingGroup" xmlns:wpi="http://schemas.microsoft.com/office/word/2010/wordprocessingInk" xmlns:wps="http://schemas.microsoft.com/office/word/2010/wordprocessingShape" xmlns:o="urn:schemas-microsoft-com:office:office" xmlns:v="urn:schemas-microsoft-com:vml" xmlns:w10="urn:schemas-microsoft-com:office:word" xmlns:w="http://schemas.openxmlformats.org/wordprocessingml/2006/main" xmlns:w14="http://schemas.microsoft.com/office/word/2010/wordml" xmlns:w15="http://schemas.microsoft.com/office/word/2012/wordml" xmlns:w16cex="http://schemas.microsoft.com/office/word/2018/wordml/cex" xmlns:w16cid="http://schemas.microsoft.com/office/word/2016/wordml/cid" xmlns:w16="http://schemas.microsoft.com/office/word/2018/wordml" xmlns:w16sdtdh="http://schemas.microsoft.com/office/word/2020/wordml/sdtdatahash" xmlns:w16sdtfl="http://schemas.microsoft.com/office/word/2024/wordml/sdtformatlock" xmlns:w16se="http://schemas.microsoft.com/office/word/2015/wordml/symex" xmlns:w16du="http://schemas.microsoft.com/office/word/2023/wordml/word16du" xmlns:wne="http://schemas.microsoft.com/office/word/2006/wordml" mc:Ignorable="w14 w15 w16se w16cid w16 w16cex w16sdtdh w16sdtfl w16du wp14">
   <w:footnote w:type="separator" w:id="-1">
     <w:p>
       <w:pPr>
@@ -7030,7 +6909,7 @@
 </file>
 
 <file path=word/styles.xml><?xml version="1.0" encoding="utf-8"?>
-<w:styles xmlns:mc="http://schemas.openxmlformats.org/markup-compatibility/2006" xmlns:r="http://schemas.openxmlformats.org/officeDocument/2006/relationships" xmlns:w="http://schemas.openxmlformats.org/wordprocessingml/2006/main" xmlns:w14="http://schemas.microsoft.com/office/word/2010/wordml" xmlns:w15="http://schemas.microsoft.com/office/word/2012/wordml" xmlns:w16cex="http://schemas.microsoft.com/office/word/2018/wordml/cex" xmlns:w16cid="http://schemas.microsoft.com/office/word/2016/wordml/cid" xmlns:w16="http://schemas.microsoft.com/office/word/2018/wordml" xmlns:w16du="http://schemas.microsoft.com/office/word/2023/wordml/word16du" xmlns:w16sdtdh="http://schemas.microsoft.com/office/word/2020/wordml/sdtdatahash" xmlns:w16sdtfl="http://schemas.microsoft.com/office/word/2024/wordml/sdtformatlock" xmlns:w16se="http://schemas.microsoft.com/office/word/2015/wordml/symex" mc:Ignorable="w14 w15 w16se w16cid w16 w16cex w16sdtdh w16sdtfl w16du">
+<w:styles xmlns:mc="http://schemas.openxmlformats.org/markup-compatibility/2006" xmlns:r="http://schemas.openxmlformats.org/officeDocument/2006/relationships" xmlns:w="http://schemas.openxmlformats.org/wordprocessingml/2006/main" xmlns:w14="http://schemas.microsoft.com/office/word/2010/wordml" xmlns:w15="http://schemas.microsoft.com/office/word/2012/wordml" xmlns:w16cex="http://schemas.microsoft.com/office/word/2018/wordml/cex" xmlns:w16cid="http://schemas.microsoft.com/office/word/2016/wordml/cid" xmlns:w16="http://schemas.microsoft.com/office/word/2018/wordml" xmlns:w16sdtdh="http://schemas.microsoft.com/office/word/2020/wordml/sdtdatahash" xmlns:w16sdtfl="http://schemas.microsoft.com/office/word/2024/wordml/sdtformatlock" xmlns:w16se="http://schemas.microsoft.com/office/word/2015/wordml/symex" xmlns:w16du="http://schemas.microsoft.com/office/word/2023/wordml/word16du" mc:Ignorable="w14 w15 w16se w16cid w16 w16cex w16sdtdh w16sdtfl w16du">
   <w:docDefaults>
     <w:rPrDefault>
       <w:rPr>

</xml_diff>